<commit_message>
Update po pierwszym sprawdzaniu
</commit_message>
<xml_diff>
--- a/02_DZW-GrA(KutnySierotaKazimirski)_v0.docx
+++ b/02_DZW-GrA(KutnySierotaKazimirski)_v0.docx
@@ -609,11 +609,12 @@
     <w:p>
       <w:pPr>
         <w:pStyle w:val="Nagwek1"/>
-        <w:numPr>
-          <w:ilvl w:val="0"/>
-          <w:numId w:val="0"/>
-        </w:numPr>
-        <w:ind w:left="0"/>
+        <w:suppressLineNumbers w:val="0"/>
+        <w:bidi w:val="0"/>
+        <w:spacing w:before="240" w:beforeAutospacing="off" w:after="0" w:afterAutospacing="off" w:line="276" w:lineRule="auto"/>
+        <w:ind w:left="360" w:right="0" w:hanging="360"/>
+        <w:jc w:val="both"/>
+        <w:rPr/>
       </w:pPr>
       <w:r>
         <w:rPr/>
@@ -641,11 +642,20 @@
     <w:p>
       <w:pPr>
         <w:pStyle w:val="Nagwek1"/>
-        <w:rPr/>
-      </w:pPr>
-      <w:r>
-        <w:rPr/>
-        <w:t>Cele systemu</w:t>
+        <w:suppressLineNumbers w:val="0"/>
+        <w:bidi w:val="0"/>
+        <w:spacing w:before="240" w:beforeAutospacing="off" w:after="0" w:afterAutospacing="off" w:line="276" w:lineRule="auto"/>
+        <w:ind w:left="360" w:right="0" w:hanging="360"/>
+        <w:jc w:val="both"/>
+        <w:rPr/>
+      </w:pPr>
+      <w:r>
+        <w:rPr/>
+        <w:t xml:space="preserve">Cele </w:t>
+      </w:r>
+      <w:r>
+        <w:rPr/>
+        <w:t>systemu</w:t>
       </w:r>
     </w:p>
     <w:p>
@@ -668,67 +678,157 @@
     <w:p>
       <w:pPr>
         <w:pStyle w:val="Nagwek1"/>
-        <w:numPr>
-          <w:ilvl w:val="0"/>
-          <w:numId w:val="2"/>
-        </w:numPr>
+        <w:suppressLineNumbers w:val="0"/>
+        <w:tabs>
+          <w:tab w:val="left" w:leader="none" w:pos="360"/>
+        </w:tabs>
+        <w:bidi w:val="0"/>
+        <w:spacing w:before="240" w:beforeAutospacing="off" w:after="0" w:afterAutospacing="off" w:line="276" w:lineRule="auto"/>
+        <w:ind w:right="0"/>
+        <w:jc w:val="both"/>
+        <w:rPr/>
+      </w:pPr>
+      <w:r>
+        <w:rPr/>
+        <w:t>Kontekst</w:t>
+      </w:r>
+      <w:r>
+        <w:rPr/>
+        <w:t xml:space="preserve"> systemu</w:t>
+      </w:r>
+    </w:p>
+    <w:p>
+      <w:pPr>
+        <w:pStyle w:val="Podpowiedzi"/>
+      </w:pPr>
+      <w:r>
+        <w:rPr/>
+        <w:t>System kamer na pojazdach komunalnych</w:t>
+      </w:r>
+      <w:r>
+        <w:rPr/>
+        <w:t xml:space="preserve"> z </w:t>
+      </w:r>
+      <w:r>
+        <w:rPr/>
+        <w:t>dostepem</w:t>
+      </w:r>
+      <w:r>
+        <w:rPr/>
+        <w:t xml:space="preserve"> do </w:t>
+      </w:r>
+      <w:r>
+        <w:rPr/>
+        <w:t>internetu</w:t>
+      </w:r>
+      <w:r>
+        <w:rPr/>
+        <w:t>, zap</w:t>
+      </w:r>
+      <w:r>
+        <w:rPr/>
+        <w:t xml:space="preserve">isujących </w:t>
+      </w:r>
+      <w:r>
+        <w:rPr/>
+        <w:t>geolokalizację</w:t>
+      </w:r>
+      <w:r>
+        <w:rPr/>
+        <w:t xml:space="preserve"> dziur na drodze rozpoznawanych za pomocą </w:t>
+      </w:r>
+      <w:r>
+        <w:rPr/>
+        <w:t xml:space="preserve">modelu YOLOv8 wytrenowanego na zbiorze Global </w:t>
+      </w:r>
+      <w:r>
+        <w:rPr/>
+        <w:t>Pothole</w:t>
+      </w:r>
+      <w:r>
+        <w:rPr/>
+        <w:t xml:space="preserve"> </w:t>
+      </w:r>
+      <w:r>
+        <w:rPr/>
+        <w:t>Dataset</w:t>
+      </w:r>
+      <w:r>
+        <w:rPr/>
+        <w:t xml:space="preserve"> z dodatkowymi zdjęciami dróg lokalnych</w:t>
+      </w:r>
+      <w:r>
+        <w:rPr/>
+        <w:t>. Zapisa</w:t>
+      </w:r>
+      <w:r>
+        <w:rPr/>
+        <w:t xml:space="preserve">ne dane </w:t>
+      </w:r>
+      <w:r>
+        <w:rPr/>
+        <w:t>geolokalizacyjne</w:t>
+      </w:r>
+      <w:r>
+        <w:rPr/>
+        <w:t xml:space="preserve"> </w:t>
+      </w:r>
+      <w:r>
+        <w:rPr/>
+        <w:t>są zaznaczane w formie pinezki na mapach</w:t>
+      </w:r>
+      <w:r>
+        <w:rPr/>
+        <w:t xml:space="preserve"> </w:t>
+      </w:r>
+      <w:r>
+        <w:rPr/>
+        <w:t>OpenStreetMap</w:t>
+      </w:r>
+      <w:r>
+        <w:rPr/>
+        <w:t>.</w:t>
+      </w:r>
+      <w:r>
+        <w:rPr/>
+        <w:t xml:space="preserve"> Za pomocą API Google </w:t>
+      </w:r>
+      <w:r>
+        <w:rPr/>
+        <w:t>Maps</w:t>
+      </w:r>
+      <w:r>
+        <w:rPr/>
+        <w:t xml:space="preserve"> jesteśmy w stanie otworzyć koordynaty </w:t>
+      </w:r>
+      <w:r>
+        <w:rPr/>
+        <w:t>geolokalizacyjne</w:t>
+      </w:r>
+      <w:r>
+        <w:rPr/>
+        <w:t xml:space="preserve"> w aplikacji Google </w:t>
+      </w:r>
+      <w:r>
+        <w:rPr/>
+        <w:t>Maps</w:t>
+      </w:r>
+      <w:r>
+        <w:rPr/>
+        <w:t>, którą każdy ma na telefonie.</w:t>
+      </w:r>
+    </w:p>
+    <w:p>
+      <w:pPr>
+        <w:pStyle w:val="Nagwek1"/>
         <w:tabs>
           <w:tab w:val="left" w:pos="360"/>
         </w:tabs>
         <w:spacing w:before="240"/>
-        <w:rPr>
-          <w:iCs/>
-        </w:rPr>
-      </w:pPr>
-      <w:r>
-        <w:rPr>
-          <w:iCs/>
-        </w:rPr>
-        <w:t>Kontekst systemu</w:t>
-      </w:r>
-    </w:p>
-    <w:p>
-      <w:pPr>
-        <w:pStyle w:val="Podpowiedzi"/>
-      </w:pPr>
-      <w:r>
-        <w:t xml:space="preserve">System kamer na pojazdach komunalnych, zapisujących geolokalizację dziur na drodze rozpoznawanych za pomocą wytrenowanego modelu AI Computer Vision. Zapisane dane geolokalizacyjne </w:t>
-      </w:r>
-      <w:r>
-        <w:t xml:space="preserve">są zaznaczane w formie pinezki na mapach. W takiej formie dostarczane do klienta razem z narzędziami </w:t>
-      </w:r>
-      <w:r>
-        <w:t>proponującymi przydział najbliższego pojazdu naprawczego</w:t>
-      </w:r>
-      <w:r>
-        <w:t>.</w:t>
-      </w:r>
-      <w:r>
-        <w:t xml:space="preserve"> Podział użytkowników na zarządcę i pracownika. Zarządca </w:t>
-      </w:r>
-      <w:r>
-        <w:t>przydziela wszystkie lokalizacje do pracownika – który później w łatwy sposób może zobaczyć, gdzie jest dziura i trasę do niej. Aktualny system lokalizacji ubytków opiera się na zgłoszeniach mieszkańców i manualnej kontroli przez służby komunalne. Taki system działa, ale jest wolny i niedokładny.</w:t>
-      </w:r>
-    </w:p>
-    <w:p>
-      <w:pPr>
-        <w:pStyle w:val="Nagwek1"/>
-        <w:numPr>
-          <w:ilvl w:val="0"/>
-          <w:numId w:val="2"/>
-        </w:numPr>
-        <w:tabs>
-          <w:tab w:val="left" w:pos="360"/>
-        </w:tabs>
-        <w:spacing w:before="240"/>
-        <w:rPr>
-          <w:iCs/>
-        </w:rPr>
-      </w:pPr>
-      <w:r>
-        <w:rPr>
-          <w:iCs/>
-        </w:rPr>
+        <w:rPr/>
+      </w:pPr>
+      <w:r>
+        <w:rPr/>
         <w:t>Zakres systemu (funkcjonalność)</w:t>
       </w:r>
     </w:p>
@@ -813,22 +913,14 @@
     <w:p>
       <w:pPr>
         <w:pStyle w:val="Nagwek1"/>
-        <w:numPr>
-          <w:ilvl w:val="0"/>
-          <w:numId w:val="2"/>
-        </w:numPr>
         <w:tabs>
           <w:tab w:val="left" w:pos="360"/>
         </w:tabs>
         <w:spacing w:before="240"/>
-        <w:rPr>
-          <w:iCs/>
-        </w:rPr>
-      </w:pPr>
-      <w:r>
-        <w:rPr>
-          <w:iCs/>
-        </w:rPr>
+        <w:rPr/>
+      </w:pPr>
+      <w:r>
+        <w:rPr/>
         <w:t>Wymagania jakościowe i inne</w:t>
       </w:r>
     </w:p>
@@ -953,168 +1045,123 @@
     <w:p>
       <w:pPr>
         <w:pStyle w:val="Podpowiedzi"/>
-        <w:numPr>
-          <w:ilvl w:val="0"/>
-          <w:numId w:val="5"/>
-        </w:numPr>
-        <w:rPr/>
-      </w:pPr>
-      <w:r>
-        <w:rPr/>
-        <w:t>API Google Maps</w:t>
+      </w:pPr>
+      <w:r>
+        <w:rPr/>
+        <w:t>Mikrokontorler</w:t>
+      </w:r>
+      <w:r>
+        <w:rPr/>
+        <w:t xml:space="preserve"> przesyła d</w:t>
+      </w:r>
+      <w:r>
+        <w:rPr/>
+        <w:t>ane</w:t>
+      </w:r>
+      <w:r>
+        <w:rPr/>
+        <w:t xml:space="preserve"> przez nasz</w:t>
+      </w:r>
+      <w:r>
+        <w:rPr/>
+        <w:t xml:space="preserve"> </w:t>
+      </w:r>
+      <w:r>
+        <w:rPr/>
+        <w:t>backend</w:t>
+      </w:r>
+      <w:r>
+        <w:rPr/>
+        <w:t xml:space="preserve"> w </w:t>
+      </w:r>
+      <w:r>
+        <w:rPr/>
+        <w:t>Python</w:t>
+      </w:r>
+      <w:r>
+        <w:rPr/>
+        <w:t xml:space="preserve"> (</w:t>
+      </w:r>
+      <w:r>
+        <w:rPr/>
+        <w:t>FastAPI</w:t>
+      </w:r>
+      <w:r>
+        <w:rPr/>
+        <w:t>)</w:t>
+      </w:r>
+      <w:r>
+        <w:rPr/>
+        <w:t xml:space="preserve"> </w:t>
+      </w:r>
+      <w:r>
+        <w:rPr/>
+        <w:t>do naszej bazy</w:t>
+      </w:r>
+      <w:r>
+        <w:rPr/>
+        <w:t xml:space="preserve"> danych </w:t>
+      </w:r>
+      <w:r>
+        <w:rPr/>
+        <w:t>PostgreSQL</w:t>
+      </w:r>
+      <w:r>
+        <w:rPr/>
+        <w:t xml:space="preserve"> (</w:t>
+      </w:r>
+      <w:r>
+        <w:rPr/>
+        <w:t>PostGIS</w:t>
+      </w:r>
+      <w:r>
+        <w:rPr/>
+        <w:t>).</w:t>
+      </w:r>
+      <w:r>
+        <w:rPr/>
+        <w:t xml:space="preserve"> </w:t>
+      </w:r>
+      <w:r>
+        <w:rPr/>
+        <w:t xml:space="preserve">Dane są wykorzystane w aplikacji webowej typu SPA napisanej w </w:t>
+      </w:r>
+      <w:r>
+        <w:rPr/>
+        <w:t>TypeScript</w:t>
+      </w:r>
+      <w:r>
+        <w:rPr/>
+        <w:t xml:space="preserve"> z użyciem biblioteki React. </w:t>
+      </w:r>
+      <w:r>
+        <w:rPr/>
+        <w:t>W</w:t>
+      </w:r>
+      <w:r>
+        <w:rPr/>
+        <w:t xml:space="preserve"> takiej formie dostarczane do klienta razem z narzędziami proponującymi przydział najbliższego pojazdu naprawczego</w:t>
+      </w:r>
+      <w:r>
+        <w:rPr/>
+        <w:t>.</w:t>
+      </w:r>
+      <w:r>
+        <w:rPr/>
+        <w:t xml:space="preserve"> Podział użytkowników na zarządcę i pracownika. Zarządca przydziela wszystkie lokalizacje do pracownika – który później w łatwy sposób może zobaczyć, gdzie jest dziura i trasę do niej. Aktualny system lokalizacji ubytków opiera się na zgłoszeniach mieszkańców i manualnej kontroli przez służby komunalne. Taki system działa, ale jest wolny i niedokładny.</w:t>
       </w:r>
     </w:p>
     <w:p>
       <w:pPr>
-        <w:pStyle w:val="Podpowiedzi"/>
-        <w:numPr>
-          <w:ilvl w:val="0"/>
-          <w:numId w:val="5"/>
-        </w:numPr>
-        <w:rPr/>
-      </w:pPr>
-      <w:r>
-        <w:rPr/>
-        <w:t>OpenStreetMap</w:t>
-      </w:r>
-    </w:p>
-    <w:p>
-      <w:pPr>
-        <w:pStyle w:val="Podpowiedzi"/>
-        <w:numPr>
-          <w:ilvl w:val="0"/>
-          <w:numId w:val="5"/>
-        </w:numPr>
-        <w:rPr/>
-      </w:pPr>
-      <w:r>
-        <w:rPr/>
-        <w:t xml:space="preserve">Model YOLOv8 wytrenowany na zbiorze danych Global </w:t>
-      </w:r>
-      <w:r>
-        <w:rPr/>
-        <w:t>Pothole</w:t>
-      </w:r>
-      <w:r>
-        <w:rPr/>
-        <w:t xml:space="preserve"> </w:t>
-      </w:r>
-      <w:r>
-        <w:rPr/>
-        <w:t>Dataset</w:t>
-      </w:r>
-      <w:r>
-        <w:rPr/>
-        <w:t xml:space="preserve"> z dodatkowymi zdjęciami dróg lokalnych</w:t>
-      </w:r>
-    </w:p>
-    <w:p>
-      <w:pPr>
-        <w:pStyle w:val="Podpowiedzi"/>
-        <w:numPr>
-          <w:ilvl w:val="0"/>
-          <w:numId w:val="5"/>
-        </w:numPr>
-      </w:pPr>
-      <w:r>
-        <w:t>Kamery z dostępem do internetu</w:t>
-      </w:r>
-    </w:p>
-    <w:p>
-      <w:pPr>
-        <w:pStyle w:val="Podpowiedzi"/>
-        <w:numPr>
-          <w:ilvl w:val="0"/>
-          <w:numId w:val="5"/>
-        </w:numPr>
-        <w:rPr/>
-      </w:pPr>
-      <w:r>
-        <w:rPr/>
-        <w:t>Backend</w:t>
-      </w:r>
-      <w:r>
-        <w:rPr/>
-        <w:t xml:space="preserve">: </w:t>
-      </w:r>
-      <w:r>
-        <w:rPr/>
-        <w:t>Python</w:t>
-      </w:r>
-      <w:r>
-        <w:rPr/>
-        <w:t xml:space="preserve"> (</w:t>
-      </w:r>
-      <w:r>
-        <w:rPr/>
-        <w:t>FastAPI</w:t>
-      </w:r>
-      <w:r>
-        <w:rPr/>
-        <w:t>)</w:t>
-      </w:r>
-      <w:r>
-        <w:rPr/>
-        <w:t xml:space="preserve"> + </w:t>
-      </w:r>
-      <w:r>
-        <w:rPr/>
-        <w:t>Postgre</w:t>
-      </w:r>
-      <w:r>
-        <w:rPr/>
-        <w:t>SQL</w:t>
-      </w:r>
-      <w:r>
-        <w:rPr/>
-        <w:t xml:space="preserve"> (</w:t>
-      </w:r>
-      <w:r>
-        <w:rPr/>
-        <w:t>PostGIS</w:t>
-      </w:r>
-      <w:r>
-        <w:rPr/>
-        <w:t>)</w:t>
-      </w:r>
-    </w:p>
-    <w:p>
-      <w:pPr>
-        <w:pStyle w:val="Podpowiedzi"/>
-        <w:numPr>
-          <w:ilvl w:val="0"/>
-          <w:numId w:val="5"/>
-        </w:numPr>
-        <w:rPr/>
-      </w:pPr>
-      <w:r>
-        <w:rPr/>
-        <w:t>Frontend</w:t>
-      </w:r>
-      <w:r>
-        <w:rPr/>
-        <w:t>: Aplikacja webowa typa SPA (React)</w:t>
-      </w:r>
-    </w:p>
-    <w:p>
-      <w:pPr>
         <w:pStyle w:val="Nagwek1"/>
-        <w:numPr>
-          <w:ilvl w:val="0"/>
-          <w:numId w:val="2"/>
-        </w:numPr>
         <w:tabs>
           <w:tab w:val="left" w:pos="360"/>
         </w:tabs>
         <w:spacing w:before="240"/>
-        <w:rPr>
-          <w:iCs/>
-        </w:rPr>
-      </w:pPr>
-      <w:r>
-        <w:rPr>
-          <w:iCs/>
-        </w:rPr>
+        <w:rPr/>
+      </w:pPr>
+      <w:r>
+        <w:rPr/>
         <w:t>Ograniczenia</w:t>
       </w:r>
     </w:p>
@@ -1198,30 +1245,47 @@
           <w:ilvl w:val="0"/>
           <w:numId w:val="7"/>
         </w:numPr>
-      </w:pPr>
-      <w:r>
+        <w:rPr/>
+      </w:pPr>
+      <w:r>
+        <w:rPr/>
         <w:t>Problemy z zasięgiem w niektórych częściach miasta</w:t>
       </w:r>
     </w:p>
     <w:p>
       <w:pPr>
-        <w:pStyle w:val="Nagwek1"/>
+        <w:pStyle w:val="Podpowiedzi"/>
         <w:numPr>
           <w:ilvl w:val="0"/>
-          <w:numId w:val="2"/>
+          <w:numId w:val="7"/>
         </w:numPr>
+        <w:suppressLineNumbers w:val="0"/>
+        <w:bidi w:val="0"/>
+        <w:spacing w:before="0" w:beforeAutospacing="off" w:after="0" w:afterAutospacing="off" w:line="240" w:lineRule="auto"/>
+        <w:ind w:right="0"/>
+        <w:jc w:val="both"/>
+        <w:rPr/>
+      </w:pPr>
+      <w:r>
+        <w:rPr/>
+        <w:t xml:space="preserve">Budżet: </w:t>
+      </w:r>
+      <w:r>
+        <w:rPr/>
+        <w:t>2400zł (po 800zł na osobę)</w:t>
+      </w:r>
+    </w:p>
+    <w:p>
+      <w:pPr>
+        <w:pStyle w:val="Nagwek1"/>
         <w:tabs>
           <w:tab w:val="left" w:pos="360"/>
         </w:tabs>
         <w:spacing w:before="240"/>
-        <w:rPr>
-          <w:iCs/>
-        </w:rPr>
-      </w:pPr>
-      <w:r>
-        <w:rPr>
-          <w:iCs/>
-        </w:rPr>
+        <w:rPr/>
+      </w:pPr>
+      <w:r>
+        <w:rPr/>
         <w:t>Słownik pojęć</w:t>
       </w:r>
     </w:p>
@@ -1864,16 +1928,101 @@
 
 <file path=word/numbering.xml><?xml version="1.0" encoding="utf-8"?>
 <w:numbering xmlns:wpc="http://schemas.microsoft.com/office/word/2010/wordprocessingCanvas" xmlns:cx="http://schemas.microsoft.com/office/drawing/2014/chartex" xmlns:cx1="http://schemas.microsoft.com/office/drawing/2015/9/8/chartex" xmlns:cx2="http://schemas.microsoft.com/office/drawing/2015/10/21/chartex" xmlns:cx3="http://schemas.microsoft.com/office/drawing/2016/5/9/chartex" xmlns:cx4="http://schemas.microsoft.com/office/drawing/2016/5/10/chartex" xmlns:cx5="http://schemas.microsoft.com/office/drawing/2016/5/11/chartex" xmlns:cx6="http://schemas.microsoft.com/office/drawing/2016/5/12/chartex" xmlns:cx7="http://schemas.microsoft.com/office/drawing/2016/5/13/chartex" xmlns:cx8="http://schemas.microsoft.com/office/drawing/2016/5/14/chartex" xmlns:mc="http://schemas.openxmlformats.org/markup-compatibility/2006" xmlns:aink="http://schemas.microsoft.com/office/drawing/2016/ink" xmlns:am3d="http://schemas.microsoft.com/office/drawing/2017/model3d" xmlns:o="urn:schemas-microsoft-com:office:office" xmlns:oel="http://schemas.microsoft.com/office/2019/extlst" xmlns:r="http://schemas.openxmlformats.org/officeDocument/2006/relationships" xmlns:m="http://schemas.openxmlformats.org/officeDocument/2006/math" xmlns:v="urn:schemas-microsoft-com:vml" xmlns:wp14="http://schemas.microsoft.com/office/word/2010/wordprocessingDrawing" xmlns:wp="http://schemas.openxmlformats.org/drawingml/2006/wordprocessingDrawing" xmlns:w10="urn:schemas-microsoft-com:office:word" xmlns:w="http://schemas.openxmlformats.org/wordprocessingml/2006/main" xmlns:w14="http://schemas.microsoft.com/office/word/2010/wordml" xmlns:w15="http://schemas.microsoft.com/office/word/2012/wordml" xmlns:w16cex="http://schemas.microsoft.com/office/word/2018/wordml/cex" xmlns:w16cid="http://schemas.microsoft.com/office/word/2016/wordml/cid" xmlns:w16="http://schemas.microsoft.com/office/word/2018/wordml" xmlns:w16du="http://schemas.microsoft.com/office/word/2023/wordml/word16du" xmlns:w16sdtdh="http://schemas.microsoft.com/office/word/2020/wordml/sdtdatahash" xmlns:w16sdtfl="http://schemas.microsoft.com/office/word/2024/wordml/sdtformatlock" xmlns:w16se="http://schemas.microsoft.com/office/word/2015/wordml/symex" xmlns:wpg="http://schemas.microsoft.com/office/word/2010/wordprocessingGroup" xmlns:wpi="http://schemas.microsoft.com/office/word/2010/wordprocessingInk" xmlns:wne="http://schemas.microsoft.com/office/word/2006/wordml" xmlns:wps="http://schemas.microsoft.com/office/word/2010/wordprocessingShape" mc:Ignorable="w14 w15 w16se w16cid w16 w16cex w16sdtdh w16sdtfl w16du wp14">
+  <w:abstractNum xmlns:w="http://schemas.openxmlformats.org/wordprocessingml/2006/main" w:abstractNumId="8">
+    <w:nsid w:val="6e508f9b"/>
+    <w:multiLevelType xmlns:w="http://schemas.openxmlformats.org/wordprocessingml/2006/main" w:val="hybridMultilevel"/>
+    <w:lvl xmlns:w="http://schemas.openxmlformats.org/wordprocessingml/2006/main" w:ilvl="0">
+      <w:start w:val="3"/>
+      <w:numFmt w:val="decimal"/>
+      <w:lvlText w:val="%1"/>
+      <w:lvlJc w:val="left"/>
+      <w:pPr>
+        <w:ind w:left="360" w:hanging="360"/>
+      </w:pPr>
+    </w:lvl>
+    <w:lvl xmlns:w="http://schemas.openxmlformats.org/wordprocessingml/2006/main" w:ilvl="1">
+      <w:start w:val="1"/>
+      <w:numFmt w:val="lowerLetter"/>
+      <w:lvlText w:val="%2."/>
+      <w:lvlJc w:val="left"/>
+      <w:pPr>
+        <w:ind w:left="360" w:hanging="360"/>
+      </w:pPr>
+    </w:lvl>
+    <w:lvl xmlns:w="http://schemas.openxmlformats.org/wordprocessingml/2006/main" w:ilvl="2">
+      <w:start w:val="1"/>
+      <w:numFmt w:val="lowerRoman"/>
+      <w:lvlText w:val="%3."/>
+      <w:lvlJc w:val="right"/>
+      <w:pPr>
+        <w:ind w:left="720" w:hanging="180"/>
+      </w:pPr>
+    </w:lvl>
+    <w:lvl xmlns:w="http://schemas.openxmlformats.org/wordprocessingml/2006/main" w:ilvl="3">
+      <w:start w:val="1"/>
+      <w:numFmt w:val="decimal"/>
+      <w:lvlText w:val="%4."/>
+      <w:lvlJc w:val="left"/>
+      <w:pPr>
+        <w:ind w:left="720" w:hanging="360"/>
+      </w:pPr>
+    </w:lvl>
+    <w:lvl xmlns:w="http://schemas.openxmlformats.org/wordprocessingml/2006/main" w:ilvl="4">
+      <w:start w:val="1"/>
+      <w:numFmt w:val="lowerLetter"/>
+      <w:lvlText w:val="%5."/>
+      <w:lvlJc w:val="left"/>
+      <w:pPr>
+        <w:ind w:left="1080" w:hanging="360"/>
+      </w:pPr>
+    </w:lvl>
+    <w:lvl xmlns:w="http://schemas.openxmlformats.org/wordprocessingml/2006/main" w:ilvl="5">
+      <w:start w:val="1"/>
+      <w:numFmt w:val="lowerRoman"/>
+      <w:lvlText w:val="%6."/>
+      <w:lvlJc w:val="right"/>
+      <w:pPr>
+        <w:ind w:left="1080" w:hanging="180"/>
+      </w:pPr>
+    </w:lvl>
+    <w:lvl xmlns:w="http://schemas.openxmlformats.org/wordprocessingml/2006/main" w:ilvl="6">
+      <w:start w:val="1"/>
+      <w:numFmt w:val="decimal"/>
+      <w:lvlText w:val="%7."/>
+      <w:lvlJc w:val="left"/>
+      <w:pPr>
+        <w:ind w:left="1440" w:hanging="360"/>
+      </w:pPr>
+    </w:lvl>
+    <w:lvl xmlns:w="http://schemas.openxmlformats.org/wordprocessingml/2006/main" w:ilvl="7">
+      <w:start w:val="1"/>
+      <w:numFmt w:val="lowerLetter"/>
+      <w:lvlText w:val="%8."/>
+      <w:lvlJc w:val="left"/>
+      <w:pPr>
+        <w:ind w:left="1440" w:hanging="360"/>
+      </w:pPr>
+    </w:lvl>
+    <w:lvl xmlns:w="http://schemas.openxmlformats.org/wordprocessingml/2006/main" w:ilvl="8">
+      <w:start w:val="1"/>
+      <w:numFmt w:val="lowerRoman"/>
+      <w:lvlText w:val="%9."/>
+      <w:lvlJc w:val="right"/>
+      <w:pPr>
+        <w:ind w:left="1800" w:hanging="180"/>
+      </w:pPr>
+    </w:lvl>
+  </w:abstractNum>
   <w:abstractNum w:abstractNumId="0" w15:restartNumberingAfterBreak="0">
     <w:nsid w:val="00000001"/>
-    <w:multiLevelType w:val="multilevel"/>
+    <w:multiLevelType w:val="hybridMultilevel"/>
     <w:tmpl w:val="00000001"/>
     <w:lvl w:ilvl="0">
       <w:start w:val="1"/>
-      <w:numFmt w:val="none"/>
+      <w:numFmt w:val="decimal"/>
       <w:pStyle w:val="Nagwek1"/>
       <w:suff w:val="nothing"/>
-      <w:lvlText w:val=""/>
+      <w:lvlText w:val="%1"/>
       <w:lvlJc w:val="left"/>
       <w:pPr>
         <w:tabs>
@@ -1884,7 +2033,7 @@
     </w:lvl>
     <w:lvl w:ilvl="1">
       <w:start w:val="1"/>
-      <w:numFmt w:val="none"/>
+      <w:numFmt w:val="decimal"/>
       <w:suff w:val="nothing"/>
       <w:lvlText w:val=""/>
       <w:lvlJc w:val="left"/>
@@ -1897,7 +2046,7 @@
     </w:lvl>
     <w:lvl w:ilvl="2">
       <w:start w:val="1"/>
-      <w:numFmt w:val="none"/>
+      <w:numFmt w:val="decimal"/>
       <w:suff w:val="nothing"/>
       <w:lvlText w:val=""/>
       <w:lvlJc w:val="left"/>
@@ -1910,7 +2059,7 @@
     </w:lvl>
     <w:lvl w:ilvl="3">
       <w:start w:val="1"/>
-      <w:numFmt w:val="none"/>
+      <w:numFmt w:val="decimal"/>
       <w:suff w:val="nothing"/>
       <w:lvlText w:val=""/>
       <w:lvlJc w:val="left"/>
@@ -1923,7 +2072,7 @@
     </w:lvl>
     <w:lvl w:ilvl="4">
       <w:start w:val="1"/>
-      <w:numFmt w:val="none"/>
+      <w:numFmt w:val="decimal"/>
       <w:suff w:val="nothing"/>
       <w:lvlText w:val=""/>
       <w:lvlJc w:val="left"/>
@@ -1936,7 +2085,7 @@
     </w:lvl>
     <w:lvl w:ilvl="5">
       <w:start w:val="1"/>
-      <w:numFmt w:val="none"/>
+      <w:numFmt w:val="decimal"/>
       <w:suff w:val="nothing"/>
       <w:lvlText w:val=""/>
       <w:lvlJc w:val="left"/>
@@ -1949,7 +2098,7 @@
     </w:lvl>
     <w:lvl w:ilvl="6">
       <w:start w:val="1"/>
-      <w:numFmt w:val="none"/>
+      <w:numFmt w:val="decimal"/>
       <w:suff w:val="nothing"/>
       <w:lvlText w:val=""/>
       <w:lvlJc w:val="left"/>
@@ -1962,7 +2111,7 @@
     </w:lvl>
     <w:lvl w:ilvl="7">
       <w:start w:val="1"/>
-      <w:numFmt w:val="none"/>
+      <w:numFmt w:val="decimal"/>
       <w:suff w:val="nothing"/>
       <w:lvlText w:val=""/>
       <w:lvlJc w:val="left"/>
@@ -1975,7 +2124,7 @@
     </w:lvl>
     <w:lvl w:ilvl="8">
       <w:start w:val="1"/>
-      <w:numFmt w:val="none"/>
+      <w:numFmt w:val="decimal"/>
       <w:suff w:val="nothing"/>
       <w:lvlText w:val=""/>
       <w:lvlJc w:val="left"/>
@@ -1989,7 +2138,7 @@
   </w:abstractNum>
   <w:abstractNum w:abstractNumId="1" w15:restartNumberingAfterBreak="0">
     <w:nsid w:val="00000002"/>
-    <w:multiLevelType w:val="multilevel"/>
+    <w:multiLevelType w:val="hybridMultilevel"/>
     <w:tmpl w:val="00000002"/>
     <w:name w:val="WW8Num9"/>
     <w:lvl w:ilvl="0">
@@ -2779,6 +2928,9 @@
       </w:rPr>
     </w:lvl>
   </w:abstractNum>
+  <w:num w:numId="9">
+    <w:abstractNumId w:val="8"/>
+  </w:num>
   <w:num w:numId="1" w16cid:durableId="781071671">
     <w:abstractNumId w:val="0"/>
   </w:num>

</xml_diff>